<commit_message>
Fallbacks for mistakes after routing: unanimous-only archiving, acknowledgement deadlines that escalate to review, pause and per-line fallback switches; failure-by-failure fallback table in docs and deliverable
Co-Authored-By: Claude Opus 5.5 <noreply@anthropic.com>
</commit_message>
<xml_diff>
--- a/deliverable/Intake_Triage_Agent_Design_and_Production_Plan.docx
+++ b/deliverable/Intake_Triage_Agent_Design_and_Production_Plan.docx
@@ -65,7 +65,7 @@
         </w:rPr>
         <w:t xml:space="preserve">Harsha Dindigal · October 2026 · </w:t>
       </w:r>
-      <w:hyperlink w:history="1" r:id="rId_ouam7bpzpx_rp4ccodou">
+      <w:hyperlink w:history="1" r:id="rIdjgvcxzteurcnabynshp4y">
         <w:r>
           <w:rPr>
             <w:u w:val="single"/>
@@ -1274,7 +1274,7 @@
           <w:szCs w:val="20"/>
           <w:rFonts w:ascii="Calibri" w:cs="Calibri" w:eastAsia="Calibri" w:hAnsi="Calibri"/>
         </w:rPr>
-        <w:t xml:space="preserve">Spam, job applications and sales pitches are archived.</w:t>
+        <w:t xml:space="preserve">If automatic routing is paused, or the service line is in fallback mode, it goes to a person.</w:t>
       </w:r>
     </w:p>
     <w:p>
@@ -1293,7 +1293,7 @@
           <w:szCs w:val="20"/>
           <w:rFonts w:ascii="Calibri" w:cs="Calibri" w:eastAsia="Calibri" w:hAnsi="Calibri"/>
         </w:rPr>
-        <w:t xml:space="preserve">Existing clients go to their relationship partner, with the service-line lead copied.</w:t>
+        <w:t xml:space="preserve">Spam, job applications and sales pitches are archived, but only if all three runs agree.</w:t>
       </w:r>
     </w:p>
     <w:p>
@@ -1312,7 +1312,7 @@
           <w:szCs w:val="20"/>
           <w:rFonts w:ascii="Calibri" w:cs="Calibri" w:eastAsia="Calibri" w:hAnsi="Calibri"/>
         </w:rPr>
-        <w:t xml:space="preserve">Vague or out-of-scope enquiries, and those where the runs disagreed, go to the review queue.</w:t>
+        <w:t xml:space="preserve">Existing clients go to their relationship partner, with the service-line lead copied.</w:t>
       </w:r>
     </w:p>
     <w:p>
@@ -1331,7 +1331,7 @@
           <w:szCs w:val="20"/>
           <w:rFonts w:ascii="Calibri" w:cs="Calibri" w:eastAsia="Calibri" w:hAnsi="Calibri"/>
         </w:rPr>
-        <w:t xml:space="preserve">Complex, urgent work goes to the service-line lead, with the practice head copied.</w:t>
+        <w:t xml:space="preserve">Vague or out-of-scope enquiries, and those where the runs disagreed, go to the review queue.</w:t>
       </w:r>
     </w:p>
     <w:p>
@@ -1350,11 +1350,30 @@
           <w:szCs w:val="20"/>
           <w:rFonts w:ascii="Calibri" w:cs="Calibri" w:eastAsia="Calibri" w:hAnsi="Calibri"/>
         </w:rPr>
-        <w:t xml:space="preserve">Everything else goes to the service-line lead.</w:t>
+        <w:t xml:space="preserve">Complex, urgent work goes to the service-line lead, with the practice head copied.</w:t>
       </w:r>
     </w:p>
     <w:p>
       <w:pPr>
+        <w:pStyle w:val="ListParagraph"/>
+        <w:numPr>
+          <w:ilvl w:val="0"/>
+          <w:numId w:val="2"/>
+        </w:numPr>
+        <w:spacing w:after="40" w:line="252"/>
+      </w:pPr>
+      <w:r>
+        <w:rPr>
+          <w:color w:val="1B2335"/>
+          <w:sz w:val="20"/>
+          <w:szCs w:val="20"/>
+          <w:rFonts w:ascii="Calibri" w:cs="Calibri" w:eastAsia="Calibri" w:hAnsi="Calibri"/>
+        </w:rPr>
+        <w:t xml:space="preserve">Everything else goes to the service-line lead.</w:t>
+      </w:r>
+    </w:p>
+    <w:p>
+      <w:pPr>
         <w:spacing w:before="0" w:after="100" w:line="264"/>
       </w:pPr>
       <w:r>
@@ -1364,7 +1383,7 @@
           <w:szCs w:val="20"/>
           <w:rFonts w:ascii="Calibri" w:cs="Calibri" w:eastAsia="Calibri" w:hAnsi="Calibri"/>
         </w:rPr>
-        <w:t xml:space="preserve">The model can only choose from the firm's service lines, so it cannot name a person or invent a destination. Every rule checked is recorded and shown with the enquiry, along with all three model responses, timings and cost.</w:t>
+        <w:t xml:space="preserve">The model can only choose from the firm's service lines, so it cannot name a person or invent a destination. Every rule checked is recorded and shown with the enquiry, along with all three model responses, timings and cost. If the lead neither accepts nor reassigns an enquiry within a deadline (4 hours for urgent work, 24 for normal), it returns to the review queue.</w:t>
       </w:r>
     </w:p>
     <w:p>
@@ -2278,7 +2297,7 @@
           <w:szCs w:val="20"/>
           <w:rFonts w:ascii="Calibri" w:cs="Calibri" w:eastAsia="Calibri" w:hAnsi="Calibri"/>
         </w:rPr>
-        <w:t xml:space="preserve">Not every mistake costs the same. A missed conflict of interest, or acting on instructions hidden in an enquiry, must never happen quietly, so both are blocked by fixed rules whatever the model says. A wrong service line is costly but recoverable, and monitoring is built to catch it quickly. A complexity rating one level out costs a person a minute. The system leans towards sending more to review rather than less.</w:t>
+        <w:t xml:space="preserve">Not every mistake costs the same. A missed conflict, or acting on hidden instructions, must never happen quietly, so fixed rules block both. A wrong service line is costly but recoverable. A complexity rating one level out costs a minute. So the system leans towards sending more to review, not less.</w:t>
       </w:r>
     </w:p>
     <w:p>
@@ -2452,7 +2471,7 @@
                 <w:szCs w:val="17"/>
                 <w:rFonts w:ascii="Calibri" w:cs="Calibri" w:eastAsia="Calibri" w:hAnsi="Calibri"/>
               </w:rPr>
-              <w:t xml:space="preserve">Model errors per service line (reassigned because the line was wrong, or corrected; workload moves are recorded separately)</w:t>
+              <w:t xml:space="preserve">Model errors per service line (workload moves counted separately)</w:t>
             </w:r>
           </w:p>
         </w:tc>
@@ -3005,7 +3024,7 @@
                 <w:szCs w:val="17"/>
                 <w:rFonts w:ascii="Calibri" w:cs="Calibri" w:eastAsia="Calibri" w:hAnsi="Calibri"/>
               </w:rPr>
-              <w:t xml:space="preserve">Failures above 2% a day, or any safety case missed</w:t>
+              <w:t xml:space="preserve">Failures over 2% a day; a safety case missed</w:t>
             </w:r>
           </w:p>
         </w:tc>
@@ -3038,7 +3057,7 @@
                 <w:szCs w:val="17"/>
                 <w:rFonts w:ascii="Calibri" w:cs="Calibri" w:eastAsia="Calibri" w:hAnsi="Calibri"/>
               </w:rPr>
-              <w:t xml:space="preserve">Engineering, daily and on every change</w:t>
+              <w:t xml:space="preserve">Engineering, daily</w:t>
             </w:r>
           </w:p>
         </w:tc>
@@ -3062,24 +3081,8 @@
     </w:p>
     <w:p>
       <w:pPr>
-        <w:pStyle w:val="ListParagraph"/>
-        <w:numPr>
-          <w:ilvl w:val="0"/>
-          <w:numId w:val="4"/>
-        </w:numPr>
-        <w:spacing w:after="40" w:line="252"/>
-      </w:pPr>
-      <w:r>
-        <w:rPr>
-          <w:b/>
-          <w:bCs/>
-          <w:color w:val="0A1222"/>
-          <w:sz w:val="20"/>
-          <w:szCs w:val="20"/>
-          <w:rFonts w:ascii="Calibri" w:cs="Calibri" w:eastAsia="Calibri" w:hAnsi="Calibri"/>
-        </w:rPr>
-        <w:t xml:space="preserve">Before anything is sent.</w:t>
-      </w:r>
+        <w:spacing w:before="0" w:after="60" w:line="264"/>
+      </w:pPr>
       <w:r>
         <w:rPr>
           <w:color w:val="1B2335"/>
@@ -3087,108 +3090,7 @@
           <w:szCs w:val="20"/>
           <w:rFonts w:ascii="Calibri" w:cs="Calibri" w:eastAsia="Calibri" w:hAnsi="Calibri"/>
         </w:rPr>
-        <w:t xml:space="preserve"> Suspected manipulation, conflicts and failed classifications always go to a person. The model can't send anything to an unexpected destination. If the model is unavailable, the system retries, then tries a backup model, then the review queue. Nothing is lost.</w:t>
-      </w:r>
-    </w:p>
-    <w:p>
-      <w:pPr>
-        <w:pStyle w:val="ListParagraph"/>
-        <w:numPr>
-          <w:ilvl w:val="0"/>
-          <w:numId w:val="4"/>
-        </w:numPr>
-        <w:spacing w:after="40" w:line="252"/>
-      </w:pPr>
-      <w:r>
-        <w:rPr>
-          <w:b/>
-          <w:bCs/>
-          <w:color w:val="0A1222"/>
-          <w:sz w:val="20"/>
-          <w:szCs w:val="20"/>
-          <w:rFonts w:ascii="Calibri" w:cs="Calibri" w:eastAsia="Calibri" w:hAnsi="Calibri"/>
-        </w:rPr>
-        <w:t xml:space="preserve">For one enquiry.</w:t>
-      </w:r>
-      <w:r>
-        <w:rPr>
-          <w:color w:val="1B2335"/>
-          <w:sz w:val="20"/>
-          <w:szCs w:val="20"/>
-          <w:rFonts w:ascii="Calibri" w:cs="Calibri" w:eastAsia="Calibri" w:hAnsi="Calibri"/>
-        </w:rPr>
-        <w:t xml:space="preserve"> Leads accept or reassign with one click and give a reason. Each correction becomes new test data.</w:t>
-      </w:r>
-    </w:p>
-    <w:p>
-      <w:pPr>
-        <w:pStyle w:val="ListParagraph"/>
-        <w:numPr>
-          <w:ilvl w:val="0"/>
-          <w:numId w:val="4"/>
-        </w:numPr>
-        <w:spacing w:after="40" w:line="252"/>
-      </w:pPr>
-      <w:r>
-        <w:rPr>
-          <w:b/>
-          <w:bCs/>
-          <w:color w:val="0A1222"/>
-          <w:sz w:val="20"/>
-          <w:szCs w:val="20"/>
-          <w:rFonts w:ascii="Calibri" w:cs="Calibri" w:eastAsia="Calibri" w:hAnsi="Calibri"/>
-        </w:rPr>
-        <w:t xml:space="preserve">For a recurring mistake.</w:t>
-      </w:r>
-      <w:r>
-        <w:rPr>
-          <w:color w:val="1B2335"/>
-          <w:sz w:val="20"/>
-          <w:szCs w:val="20"/>
-          <w:rFonts w:ascii="Calibri" w:cs="Calibri" w:eastAsia="Calibri" w:hAnsi="Calibri"/>
-        </w:rPr>
-        <w:t xml:space="preserve"> Practice operations adjusts the definition or rule on the configuration screen. They check which past enquiries the change affects before saving, and rerun the test suite for any change to the model's instructions.</w:t>
-      </w:r>
-    </w:p>
-    <w:p>
-      <w:pPr>
-        <w:pStyle w:val="ListParagraph"/>
-        <w:numPr>
-          <w:ilvl w:val="0"/>
-          <w:numId w:val="4"/>
-        </w:numPr>
-        <w:spacing w:after="40" w:line="252"/>
-      </w:pPr>
-      <w:r>
-        <w:rPr>
-          <w:b/>
-          <w:bCs/>
-          <w:color w:val="0A1222"/>
-          <w:sz w:val="20"/>
-          <w:szCs w:val="20"/>
-          <w:rFonts w:ascii="Calibri" w:cs="Calibri" w:eastAsia="Calibri" w:hAnsi="Calibri"/>
-        </w:rPr>
-        <w:t xml:space="preserve">If a line keeps slipping, or the provider is down.</w:t>
-      </w:r>
-      <w:r>
-        <w:rPr>
-          <w:color w:val="1B2335"/>
-          <w:sz w:val="20"/>
-          <w:szCs w:val="20"/>
-          <w:rFonts w:ascii="Calibri" w:cs="Calibri" w:eastAsia="Calibri" w:hAnsi="Calibri"/>
-        </w:rPr>
-        <w:t xml:space="preserve"> That line returns to suggestions only, and the analyst triages it from the queue.</w:t>
-      </w:r>
-    </w:p>
-    <w:p>
-      <w:pPr>
-        <w:pStyle w:val="Heading2"/>
-      </w:pPr>
-      <w:r>
-        <w:rPr>
-          <w:rFonts w:ascii="Calibri" w:cs="Calibri" w:eastAsia="Calibri" w:hAnsi="Calibri"/>
-        </w:rPr>
-        <w:t xml:space="preserve">Rollout</w:t>
+        <w:t xml:space="preserve">The principle is that no mistake should be silent. Every wrong answer has either a person in front of it or a deadline behind it.</w:t>
       </w:r>
     </w:p>
     <w:tbl>
@@ -3204,9 +3106,10 @@
         </w:tblBorders>
       </w:tblPr>
       <w:tblGrid>
-        <w:gridCol w:w="1912"/>
-        <w:gridCol w:w="3630"/>
-        <w:gridCol w:w="4204"/>
+        <w:gridCol w:w="2039"/>
+        <w:gridCol w:w="2303"/>
+        <w:gridCol w:w="2658"/>
+        <w:gridCol w:w="2746"/>
       </w:tblGrid>
       <w:tr>
         <w:trPr>
@@ -3214,7 +3117,7 @@
         </w:trPr>
         <w:tc>
           <w:tcPr>
-            <w:tcW w:type="dxa" w:w="1912"/>
+            <w:tcW w:type="dxa" w:w="2039"/>
             <w:tcBorders>
               <w:top w:val="single" w:color="D5DBE5" w:sz="4"/>
               <w:left w:val="single" w:color="D5DBE5" w:sz="4"/>
@@ -3239,17 +3142,17 @@
                 <w:b/>
                 <w:bCs/>
                 <w:color w:val="0A1222"/>
-                <w:sz w:val="17"/>
-                <w:szCs w:val="17"/>
-                <w:rFonts w:ascii="Calibri" w:cs="Calibri" w:eastAsia="Calibri" w:hAnsi="Calibri"/>
-              </w:rPr>
-              <w:t xml:space="preserve">Phase</w:t>
-            </w:r>
-          </w:p>
-        </w:tc>
-        <w:tc>
-          <w:tcPr>
-            <w:tcW w:type="dxa" w:w="3630"/>
+                <w:sz w:val="16"/>
+                <w:szCs w:val="16"/>
+                <w:rFonts w:ascii="Calibri" w:cs="Calibri" w:eastAsia="Calibri" w:hAnsi="Calibri"/>
+              </w:rPr>
+              <w:t xml:space="preserve">What goes wrong</w:t>
+            </w:r>
+          </w:p>
+        </w:tc>
+        <w:tc>
+          <w:tcPr>
+            <w:tcW w:type="dxa" w:w="2303"/>
             <w:tcBorders>
               <w:top w:val="single" w:color="D5DBE5" w:sz="4"/>
               <w:left w:val="single" w:color="D5DBE5" w:sz="4"/>
@@ -3274,17 +3177,17 @@
                 <w:b/>
                 <w:bCs/>
                 <w:color w:val="0A1222"/>
-                <w:sz w:val="17"/>
-                <w:szCs w:val="17"/>
-                <w:rFonts w:ascii="Calibri" w:cs="Calibri" w:eastAsia="Calibri" w:hAnsi="Calibri"/>
-              </w:rPr>
-              <w:t xml:space="preserve">What changes</w:t>
-            </w:r>
-          </w:p>
-        </w:tc>
-        <w:tc>
-          <w:tcPr>
-            <w:tcW w:type="dxa" w:w="4204"/>
+                <w:sz w:val="16"/>
+                <w:szCs w:val="16"/>
+                <w:rFonts w:ascii="Calibri" w:cs="Calibri" w:eastAsia="Calibri" w:hAnsi="Calibri"/>
+              </w:rPr>
+              <w:t xml:space="preserve">How it's caught</w:t>
+            </w:r>
+          </w:p>
+        </w:tc>
+        <w:tc>
+          <w:tcPr>
+            <w:tcW w:type="dxa" w:w="2658"/>
             <w:tcBorders>
               <w:top w:val="single" w:color="D5DBE5" w:sz="4"/>
               <w:left w:val="single" w:color="D5DBE5" w:sz="4"/>
@@ -3309,11 +3212,46 @@
                 <w:b/>
                 <w:bCs/>
                 <w:color w:val="0A1222"/>
-                <w:sz w:val="17"/>
-                <w:szCs w:val="17"/>
-                <w:rFonts w:ascii="Calibri" w:cs="Calibri" w:eastAsia="Calibri" w:hAnsi="Calibri"/>
-              </w:rPr>
-              <w:t xml:space="preserve">Moves on when</w:t>
+                <w:sz w:val="16"/>
+                <w:szCs w:val="16"/>
+                <w:rFonts w:ascii="Calibri" w:cs="Calibri" w:eastAsia="Calibri" w:hAnsi="Calibri"/>
+              </w:rPr>
+              <w:t xml:space="preserve">What happens automatically</w:t>
+            </w:r>
+          </w:p>
+        </w:tc>
+        <w:tc>
+          <w:tcPr>
+            <w:tcW w:type="dxa" w:w="2746"/>
+            <w:tcBorders>
+              <w:top w:val="single" w:color="D5DBE5" w:sz="4"/>
+              <w:left w:val="single" w:color="D5DBE5" w:sz="4"/>
+              <w:bottom w:val="single" w:color="D5DBE5" w:sz="4"/>
+              <w:right w:val="single" w:color="D5DBE5" w:sz="4"/>
+            </w:tcBorders>
+            <w:shd w:fill="E8F7FA" w:color="auto" w:val="clear"/>
+            <w:tcMar>
+              <w:top w:type="dxa" w:w="50"/>
+              <w:left w:type="dxa" w:w="90"/>
+              <w:bottom w:type="dxa" w:w="50"/>
+              <w:right w:type="dxa" w:w="90"/>
+            </w:tcMar>
+            <w:vAlign w:val="top"/>
+          </w:tcPr>
+          <w:p>
+            <w:pPr>
+              <w:spacing w:after="0" w:line="240"/>
+            </w:pPr>
+            <w:r>
+              <w:rPr>
+                <w:b/>
+                <w:bCs/>
+                <w:color w:val="0A1222"/>
+                <w:sz w:val="16"/>
+                <w:szCs w:val="16"/>
+                <w:rFonts w:ascii="Calibri" w:cs="Calibri" w:eastAsia="Calibri" w:hAnsi="Calibri"/>
+              </w:rPr>
+              <w:t xml:space="preserve">How we recover</w:t>
             </w:r>
           </w:p>
         </w:tc>
@@ -3324,7 +3262,7 @@
         </w:trPr>
         <w:tc>
           <w:tcPr>
-            <w:tcW w:type="dxa" w:w="1912"/>
+            <w:tcW w:type="dxa" w:w="2039"/>
             <w:tcBorders>
               <w:top w:val="single" w:color="D5DBE5" w:sz="4"/>
               <w:left w:val="single" w:color="D5DBE5" w:sz="4"/>
@@ -3349,26 +3287,26 @@
                 <w:b/>
                 <w:bCs/>
                 <w:color w:val="0A1222"/>
-                <w:sz w:val="17"/>
-                <w:szCs w:val="17"/>
-                <w:rFonts w:ascii="Calibri" w:cs="Calibri" w:eastAsia="Calibri" w:hAnsi="Calibri"/>
-              </w:rPr>
-              <w:t xml:space="preserve">Shadow</w:t>
-            </w:r>
-            <w:r>
-              <w:rPr>
-                <w:color w:val="1B2335"/>
-                <w:sz w:val="17"/>
-                <w:szCs w:val="17"/>
-                <w:rFonts w:ascii="Calibri" w:cs="Calibri" w:eastAsia="Calibri" w:hAnsi="Calibri"/>
-              </w:rPr>
-              <w:t xml:space="preserve"> (2–4 weeks)</w:t>
-            </w:r>
-          </w:p>
-        </w:tc>
-        <w:tc>
-          <w:tcPr>
-            <w:tcW w:type="dxa" w:w="3630"/>
+                <w:sz w:val="16"/>
+                <w:szCs w:val="16"/>
+                <w:rFonts w:ascii="Calibri" w:cs="Calibri" w:eastAsia="Calibri" w:hAnsi="Calibri"/>
+              </w:rPr>
+              <w:t xml:space="preserve">Wrong service line</w:t>
+            </w:r>
+            <w:r>
+              <w:rPr>
+                <w:color w:val="1B2335"/>
+                <w:sz w:val="16"/>
+                <w:szCs w:val="16"/>
+                <w:rFonts w:ascii="Calibri" w:cs="Calibri" w:eastAsia="Calibri" w:hAnsi="Calibri"/>
+              </w:rPr>
+              <w:t xml:space="preserve">, stated confidently</w:t>
+            </w:r>
+          </w:p>
+        </w:tc>
+        <w:tc>
+          <w:tcPr>
+            <w:tcW w:type="dxa" w:w="2303"/>
             <w:tcBorders>
               <w:top w:val="single" w:color="D5DBE5" w:sz="4"/>
               <w:left w:val="single" w:color="D5DBE5" w:sz="4"/>
@@ -3391,17 +3329,17 @@
             <w:r>
               <w:rPr>
                 <w:color w:val="1B2335"/>
-                <w:sz w:val="17"/>
-                <w:szCs w:val="17"/>
-                <w:rFonts w:ascii="Calibri" w:cs="Calibri" w:eastAsia="Calibri" w:hAnsi="Calibri"/>
-              </w:rPr>
-              <w:t xml:space="preserve">Runs on every enquiry without notifying anyone; compared with the analyst weekly</w:t>
-            </w:r>
-          </w:p>
-        </w:tc>
-        <w:tc>
-          <w:tcPr>
-            <w:tcW w:type="dxa" w:w="4204"/>
+                <w:sz w:val="16"/>
+                <w:szCs w:val="16"/>
+                <w:rFonts w:ascii="Calibri" w:cs="Calibri" w:eastAsia="Calibri" w:hAnsi="Calibri"/>
+              </w:rPr>
+              <w:t xml:space="preserve">Lead reassigns; spot-check; error rate</w:t>
+            </w:r>
+          </w:p>
+        </w:tc>
+        <w:tc>
+          <w:tcPr>
+            <w:tcW w:type="dxa" w:w="2658"/>
             <w:tcBorders>
               <w:top w:val="single" w:color="D5DBE5" w:sz="4"/>
               <w:left w:val="single" w:color="D5DBE5" w:sz="4"/>
@@ -3424,11 +3362,44 @@
             <w:r>
               <w:rPr>
                 <w:color w:val="1B2335"/>
-                <w:sz w:val="17"/>
-                <w:szCs w:val="17"/>
-                <w:rFonts w:ascii="Calibri" w:cs="Calibri" w:eastAsia="Calibri" w:hAnsi="Calibri"/>
-              </w:rPr>
-              <w:t xml:space="preserve">At least 95% of enquiries needing a person are caught, at least 95% of automatic routes are correct, and no conflict or manipulation attempt is missed</w:t>
+                <w:sz w:val="16"/>
+                <w:szCs w:val="16"/>
+                <w:rFonts w:ascii="Calibri" w:cs="Calibri" w:eastAsia="Calibri" w:hAnsi="Calibri"/>
+              </w:rPr>
+              <w:t xml:space="preserve">Not accepted within 4 / 24 / 48 hours (by urgency) → back to review</w:t>
+            </w:r>
+          </w:p>
+        </w:tc>
+        <w:tc>
+          <w:tcPr>
+            <w:tcW w:type="dxa" w:w="2746"/>
+            <w:tcBorders>
+              <w:top w:val="single" w:color="D5DBE5" w:sz="4"/>
+              <w:left w:val="single" w:color="D5DBE5" w:sz="4"/>
+              <w:bottom w:val="single" w:color="D5DBE5" w:sz="4"/>
+              <w:right w:val="single" w:color="D5DBE5" w:sz="4"/>
+            </w:tcBorders>
+            <w:shd w:fill="FFFFFF" w:color="auto" w:val="clear"/>
+            <w:tcMar>
+              <w:top w:type="dxa" w:w="50"/>
+              <w:left w:type="dxa" w:w="90"/>
+              <w:bottom w:type="dxa" w:w="50"/>
+              <w:right w:type="dxa" w:w="90"/>
+            </w:tcMar>
+            <w:vAlign w:val="top"/>
+          </w:tcPr>
+          <w:p>
+            <w:pPr>
+              <w:spacing w:after="0" w:line="240"/>
+            </w:pPr>
+            <w:r>
+              <w:rPr>
+                <w:color w:val="1B2335"/>
+                <w:sz w:val="16"/>
+                <w:szCs w:val="16"/>
+                <w:rFonts w:ascii="Calibri" w:cs="Calibri" w:eastAsia="Calibri" w:hAnsi="Calibri"/>
+              </w:rPr>
+              <w:t xml:space="preserve">Reassign with a reason; repeated: fix the definition or use fallback mode</w:t>
             </w:r>
           </w:p>
         </w:tc>
@@ -3439,7 +3410,7 @@
         </w:trPr>
         <w:tc>
           <w:tcPr>
-            <w:tcW w:type="dxa" w:w="1912"/>
+            <w:tcW w:type="dxa" w:w="2039"/>
             <w:tcBorders>
               <w:top w:val="single" w:color="D5DBE5" w:sz="4"/>
               <w:left w:val="single" w:color="D5DBE5" w:sz="4"/>
@@ -3464,26 +3435,17 @@
                 <w:b/>
                 <w:bCs/>
                 <w:color w:val="0A1222"/>
-                <w:sz w:val="17"/>
-                <w:szCs w:val="17"/>
-                <w:rFonts w:ascii="Calibri" w:cs="Calibri" w:eastAsia="Calibri" w:hAnsi="Calibri"/>
-              </w:rPr>
-              <w:t xml:space="preserve">Assisted</w:t>
-            </w:r>
-            <w:r>
-              <w:rPr>
-                <w:color w:val="1B2335"/>
-                <w:sz w:val="17"/>
-                <w:szCs w:val="17"/>
-                <w:rFonts w:ascii="Calibri" w:cs="Calibri" w:eastAsia="Calibri" w:hAnsi="Calibri"/>
-              </w:rPr>
-              <w:t xml:space="preserve"> (4–8 weeks)</w:t>
-            </w:r>
-          </w:p>
-        </w:tc>
-        <w:tc>
-          <w:tcPr>
-            <w:tcW w:type="dxa" w:w="3630"/>
+                <w:sz w:val="16"/>
+                <w:szCs w:val="16"/>
+                <w:rFonts w:ascii="Calibri" w:cs="Calibri" w:eastAsia="Calibri" w:hAnsi="Calibri"/>
+              </w:rPr>
+              <w:t xml:space="preserve">Genuine enquiry mistaken for spam</w:t>
+            </w:r>
+          </w:p>
+        </w:tc>
+        <w:tc>
+          <w:tcPr>
+            <w:tcW w:type="dxa" w:w="2303"/>
             <w:tcBorders>
               <w:top w:val="single" w:color="D5DBE5" w:sz="4"/>
               <w:left w:val="single" w:color="D5DBE5" w:sz="4"/>
@@ -3506,17 +3468,17 @@
             <w:r>
               <w:rPr>
                 <w:color w:val="1B2335"/>
-                <w:sz w:val="17"/>
-                <w:szCs w:val="17"/>
-                <w:rFonts w:ascii="Calibri" w:cs="Calibri" w:eastAsia="Calibri" w:hAnsi="Calibri"/>
-              </w:rPr>
-              <w:t xml:space="preserve">Team leads confirm each suggestion with a click; the analyst works only the review queue</w:t>
-            </w:r>
-          </w:p>
-        </w:tc>
-        <w:tc>
-          <w:tcPr>
-            <w:tcW w:type="dxa" w:w="4204"/>
+                <w:sz w:val="16"/>
+                <w:szCs w:val="16"/>
+                <w:rFonts w:ascii="Calibri" w:cs="Calibri" w:eastAsia="Calibri" w:hAnsi="Calibri"/>
+              </w:rPr>
+              <w:t xml:space="preserve">Runs disagree; weekly look through the archive</w:t>
+            </w:r>
+          </w:p>
+        </w:tc>
+        <w:tc>
+          <w:tcPr>
+            <w:tcW w:type="dxa" w:w="2658"/>
             <w:tcBorders>
               <w:top w:val="single" w:color="D5DBE5" w:sz="4"/>
               <w:left w:val="single" w:color="D5DBE5" w:sz="4"/>
@@ -3539,11 +3501,44 @@
             <w:r>
               <w:rPr>
                 <w:color w:val="1B2335"/>
-                <w:sz w:val="17"/>
-                <w:szCs w:val="17"/>
-                <w:rFonts w:ascii="Calibri" w:cs="Calibri" w:eastAsia="Calibri" w:hAnsi="Calibri"/>
-              </w:rPr>
-              <w:t xml:space="preserve">Model errors below 10% for every line, and spot-checks at 95% or above</w:t>
+                <w:sz w:val="16"/>
+                <w:szCs w:val="16"/>
+                <w:rFonts w:ascii="Calibri" w:cs="Calibri" w:eastAsia="Calibri" w:hAnsi="Calibri"/>
+              </w:rPr>
+              <w:t xml:space="preserve">Archived only if all three runs agree; otherwise review</w:t>
+            </w:r>
+          </w:p>
+        </w:tc>
+        <w:tc>
+          <w:tcPr>
+            <w:tcW w:type="dxa" w:w="2746"/>
+            <w:tcBorders>
+              <w:top w:val="single" w:color="D5DBE5" w:sz="4"/>
+              <w:left w:val="single" w:color="D5DBE5" w:sz="4"/>
+              <w:bottom w:val="single" w:color="D5DBE5" w:sz="4"/>
+              <w:right w:val="single" w:color="D5DBE5" w:sz="4"/>
+            </w:tcBorders>
+            <w:shd w:fill="F7F9FC" w:color="auto" w:val="clear"/>
+            <w:tcMar>
+              <w:top w:type="dxa" w:w="50"/>
+              <w:left w:type="dxa" w:w="90"/>
+              <w:bottom w:type="dxa" w:w="50"/>
+              <w:right w:type="dxa" w:w="90"/>
+            </w:tcMar>
+            <w:vAlign w:val="top"/>
+          </w:tcPr>
+          <w:p>
+            <w:pPr>
+              <w:spacing w:after="0" w:line="240"/>
+            </w:pPr>
+            <w:r>
+              <w:rPr>
+                <w:color w:val="1B2335"/>
+                <w:sz w:val="16"/>
+                <w:szCs w:val="16"/>
+                <w:rFonts w:ascii="Calibri" w:cs="Calibri" w:eastAsia="Calibri" w:hAnsi="Calibri"/>
+              </w:rPr>
+              <w:t xml:space="preserve">Restore from the archive with one click</w:t>
             </w:r>
           </w:p>
         </w:tc>
@@ -3554,7 +3549,7 @@
         </w:trPr>
         <w:tc>
           <w:tcPr>
-            <w:tcW w:type="dxa" w:w="1912"/>
+            <w:tcW w:type="dxa" w:w="2039"/>
             <w:tcBorders>
               <w:top w:val="single" w:color="D5DBE5" w:sz="4"/>
               <w:left w:val="single" w:color="D5DBE5" w:sz="4"/>
@@ -3579,26 +3574,17 @@
                 <w:b/>
                 <w:bCs/>
                 <w:color w:val="0A1222"/>
-                <w:sz w:val="17"/>
-                <w:szCs w:val="17"/>
-                <w:rFonts w:ascii="Calibri" w:cs="Calibri" w:eastAsia="Calibri" w:hAnsi="Calibri"/>
-              </w:rPr>
-              <w:t xml:space="preserve">Automatic</w:t>
-            </w:r>
-            <w:r>
-              <w:rPr>
-                <w:color w:val="1B2335"/>
-                <w:sz w:val="17"/>
-                <w:szCs w:val="17"/>
-                <w:rFonts w:ascii="Calibri" w:cs="Calibri" w:eastAsia="Calibri" w:hAnsi="Calibri"/>
-              </w:rPr>
-              <w:t xml:space="preserve"> (clear-cut cases)</w:t>
-            </w:r>
-          </w:p>
-        </w:tc>
-        <w:tc>
-          <w:tcPr>
-            <w:tcW w:type="dxa" w:w="3630"/>
+                <w:sz w:val="16"/>
+                <w:szCs w:val="16"/>
+                <w:rFonts w:ascii="Calibri" w:cs="Calibri" w:eastAsia="Calibri" w:hAnsi="Calibri"/>
+              </w:rPr>
+              <w:t xml:space="preserve">Urgency missed</w:t>
+            </w:r>
+          </w:p>
+        </w:tc>
+        <w:tc>
+          <w:tcPr>
+            <w:tcW w:type="dxa" w:w="2303"/>
             <w:tcBorders>
               <w:top w:val="single" w:color="D5DBE5" w:sz="4"/>
               <w:left w:val="single" w:color="D5DBE5" w:sz="4"/>
@@ -3621,17 +3607,17 @@
             <w:r>
               <w:rPr>
                 <w:color w:val="1B2335"/>
-                <w:sz w:val="17"/>
-                <w:szCs w:val="17"/>
-                <w:rFonts w:ascii="Calibri" w:cs="Calibri" w:eastAsia="Calibri" w:hAnsi="Calibri"/>
-              </w:rPr>
-              <w:t xml:space="preserve">Enquiries where the runs agree, nothing is flagged and the line is performing well route without confirmation</w:t>
-            </w:r>
-          </w:p>
-        </w:tc>
-        <w:tc>
-          <w:tcPr>
-            <w:tcW w:type="dxa" w:w="4204"/>
+                <w:sz w:val="16"/>
+                <w:szCs w:val="16"/>
+                <w:rFonts w:ascii="Calibri" w:cs="Calibri" w:eastAsia="Calibri" w:hAnsi="Calibri"/>
+              </w:rPr>
+              <w:t xml:space="preserve">Model reads urgency from the text and flags mismatches</w:t>
+            </w:r>
+          </w:p>
+        </w:tc>
+        <w:tc>
+          <w:tcPr>
+            <w:tcW w:type="dxa" w:w="2658"/>
             <w:tcBorders>
               <w:top w:val="single" w:color="D5DBE5" w:sz="4"/>
               <w:left w:val="single" w:color="D5DBE5" w:sz="4"/>
@@ -3654,11 +3640,609 @@
             <w:r>
               <w:rPr>
                 <w:color w:val="1B2335"/>
-                <w:sz w:val="17"/>
-                <w:szCs w:val="17"/>
-                <w:rFonts w:ascii="Calibri" w:cs="Calibri" w:eastAsia="Calibri" w:hAnsi="Calibri"/>
-              </w:rPr>
-              <w:t xml:space="preserve">Continues while each line stays within its thresholds; a breach returns that line to assisted</w:t>
+                <w:sz w:val="16"/>
+                <w:szCs w:val="16"/>
+                <w:rFonts w:ascii="Calibri" w:cs="Calibri" w:eastAsia="Calibri" w:hAnsi="Calibri"/>
+              </w:rPr>
+              <w:t xml:space="preserve">Deadline uses the higher urgency; urgent complex work copies the practice head</w:t>
+            </w:r>
+          </w:p>
+        </w:tc>
+        <w:tc>
+          <w:tcPr>
+            <w:tcW w:type="dxa" w:w="2746"/>
+            <w:tcBorders>
+              <w:top w:val="single" w:color="D5DBE5" w:sz="4"/>
+              <w:left w:val="single" w:color="D5DBE5" w:sz="4"/>
+              <w:bottom w:val="single" w:color="D5DBE5" w:sz="4"/>
+              <w:right w:val="single" w:color="D5DBE5" w:sz="4"/>
+            </w:tcBorders>
+            <w:shd w:fill="FFFFFF" w:color="auto" w:val="clear"/>
+            <w:tcMar>
+              <w:top w:type="dxa" w:w="50"/>
+              <w:left w:type="dxa" w:w="90"/>
+              <w:bottom w:type="dxa" w:w="50"/>
+              <w:right w:type="dxa" w:w="90"/>
+            </w:tcMar>
+            <w:vAlign w:val="top"/>
+          </w:tcPr>
+          <w:p>
+            <w:pPr>
+              <w:spacing w:after="0" w:line="240"/>
+            </w:pPr>
+            <w:r>
+              <w:rPr>
+                <w:color w:val="1B2335"/>
+                <w:sz w:val="16"/>
+                <w:szCs w:val="16"/>
+                <w:rFonts w:ascii="Calibri" w:cs="Calibri" w:eastAsia="Calibri" w:hAnsi="Calibri"/>
+              </w:rPr>
+              <w:t xml:space="preserve">Reviewer routes it; case added to the test set</w:t>
+            </w:r>
+          </w:p>
+        </w:tc>
+      </w:tr>
+      <w:tr>
+        <w:trPr>
+          <w:cantSplit/>
+        </w:trPr>
+        <w:tc>
+          <w:tcPr>
+            <w:tcW w:type="dxa" w:w="2039"/>
+            <w:tcBorders>
+              <w:top w:val="single" w:color="D5DBE5" w:sz="4"/>
+              <w:left w:val="single" w:color="D5DBE5" w:sz="4"/>
+              <w:bottom w:val="single" w:color="D5DBE5" w:sz="4"/>
+              <w:right w:val="single" w:color="D5DBE5" w:sz="4"/>
+            </w:tcBorders>
+            <w:shd w:fill="F7F9FC" w:color="auto" w:val="clear"/>
+            <w:tcMar>
+              <w:top w:type="dxa" w:w="50"/>
+              <w:left w:type="dxa" w:w="90"/>
+              <w:bottom w:type="dxa" w:w="50"/>
+              <w:right w:type="dxa" w:w="90"/>
+            </w:tcMar>
+            <w:vAlign w:val="top"/>
+          </w:tcPr>
+          <w:p>
+            <w:pPr>
+              <w:spacing w:after="0" w:line="240"/>
+            </w:pPr>
+            <w:r>
+              <w:rPr>
+                <w:b/>
+                <w:bCs/>
+                <w:color w:val="0A1222"/>
+                <w:sz w:val="16"/>
+                <w:szCs w:val="16"/>
+                <w:rFonts w:ascii="Calibri" w:cs="Calibri" w:eastAsia="Calibri" w:hAnsi="Calibri"/>
+              </w:rPr>
+              <w:t xml:space="preserve">Conflict or existing client missed</w:t>
+            </w:r>
+          </w:p>
+        </w:tc>
+        <w:tc>
+          <w:tcPr>
+            <w:tcW w:type="dxa" w:w="2303"/>
+            <w:tcBorders>
+              <w:top w:val="single" w:color="D5DBE5" w:sz="4"/>
+              <w:left w:val="single" w:color="D5DBE5" w:sz="4"/>
+              <w:bottom w:val="single" w:color="D5DBE5" w:sz="4"/>
+              <w:right w:val="single" w:color="D5DBE5" w:sz="4"/>
+            </w:tcBorders>
+            <w:shd w:fill="F7F9FC" w:color="auto" w:val="clear"/>
+            <w:tcMar>
+              <w:top w:type="dxa" w:w="50"/>
+              <w:left w:type="dxa" w:w="90"/>
+              <w:bottom w:type="dxa" w:w="50"/>
+              <w:right w:type="dxa" w:w="90"/>
+            </w:tcMar>
+            <w:vAlign w:val="top"/>
+          </w:tcPr>
+          <w:p>
+            <w:pPr>
+              <w:spacing w:after="0" w:line="240"/>
+            </w:pPr>
+            <w:r>
+              <w:rPr>
+                <w:color w:val="1B2335"/>
+                <w:sz w:val="16"/>
+                <w:szCs w:val="16"/>
+                <w:rFonts w:ascii="Calibri" w:cs="Calibri" w:eastAsia="Calibri" w:hAnsi="Calibri"/>
+              </w:rPr>
+              <w:t xml:space="preserve">Hard stop; subsidiaries resolved to group</w:t>
+            </w:r>
+          </w:p>
+        </w:tc>
+        <w:tc>
+          <w:tcPr>
+            <w:tcW w:type="dxa" w:w="2658"/>
+            <w:tcBorders>
+              <w:top w:val="single" w:color="D5DBE5" w:sz="4"/>
+              <w:left w:val="single" w:color="D5DBE5" w:sz="4"/>
+              <w:bottom w:val="single" w:color="D5DBE5" w:sz="4"/>
+              <w:right w:val="single" w:color="D5DBE5" w:sz="4"/>
+            </w:tcBorders>
+            <w:shd w:fill="F7F9FC" w:color="auto" w:val="clear"/>
+            <w:tcMar>
+              <w:top w:type="dxa" w:w="50"/>
+              <w:left w:type="dxa" w:w="90"/>
+              <w:bottom w:type="dxa" w:w="50"/>
+              <w:right w:type="dxa" w:w="90"/>
+            </w:tcMar>
+            <w:vAlign w:val="top"/>
+          </w:tcPr>
+          <w:p>
+            <w:pPr>
+              <w:spacing w:after="0" w:line="240"/>
+            </w:pPr>
+            <w:r>
+              <w:rPr>
+                <w:color w:val="1B2335"/>
+                <w:sz w:val="16"/>
+                <w:szCs w:val="16"/>
+                <w:rFonts w:ascii="Calibri" w:cs="Calibri" w:eastAsia="Calibri" w:hAnsi="Calibri"/>
+              </w:rPr>
+              <w:t xml:space="preserve">Known conflicts never route automatically</w:t>
+            </w:r>
+          </w:p>
+        </w:tc>
+        <w:tc>
+          <w:tcPr>
+            <w:tcW w:type="dxa" w:w="2746"/>
+            <w:tcBorders>
+              <w:top w:val="single" w:color="D5DBE5" w:sz="4"/>
+              <w:left w:val="single" w:color="D5DBE5" w:sz="4"/>
+              <w:bottom w:val="single" w:color="D5DBE5" w:sz="4"/>
+              <w:right w:val="single" w:color="D5DBE5" w:sz="4"/>
+            </w:tcBorders>
+            <w:shd w:fill="F7F9FC" w:color="auto" w:val="clear"/>
+            <w:tcMar>
+              <w:top w:type="dxa" w:w="50"/>
+              <w:left w:type="dxa" w:w="90"/>
+              <w:bottom w:type="dxa" w:w="50"/>
+              <w:right w:type="dxa" w:w="90"/>
+            </w:tcMar>
+            <w:vAlign w:val="top"/>
+          </w:tcPr>
+          <w:p>
+            <w:pPr>
+              <w:spacing w:after="0" w:line="240"/>
+            </w:pPr>
+            <w:r>
+              <w:rPr>
+                <w:color w:val="1B2335"/>
+                <w:sz w:val="16"/>
+                <w:szCs w:val="16"/>
+                <w:rFonts w:ascii="Calibri" w:cs="Calibri" w:eastAsia="Calibri" w:hAnsi="Calibri"/>
+              </w:rPr>
+              <w:t xml:space="preserve">Reassign ("conflict"); fix the CRM record</w:t>
+            </w:r>
+          </w:p>
+        </w:tc>
+      </w:tr>
+      <w:tr>
+        <w:trPr>
+          <w:cantSplit/>
+        </w:trPr>
+        <w:tc>
+          <w:tcPr>
+            <w:tcW w:type="dxa" w:w="2039"/>
+            <w:tcBorders>
+              <w:top w:val="single" w:color="D5DBE5" w:sz="4"/>
+              <w:left w:val="single" w:color="D5DBE5" w:sz="4"/>
+              <w:bottom w:val="single" w:color="D5DBE5" w:sz="4"/>
+              <w:right w:val="single" w:color="D5DBE5" w:sz="4"/>
+            </w:tcBorders>
+            <w:shd w:fill="FFFFFF" w:color="auto" w:val="clear"/>
+            <w:tcMar>
+              <w:top w:type="dxa" w:w="50"/>
+              <w:left w:type="dxa" w:w="90"/>
+              <w:bottom w:type="dxa" w:w="50"/>
+              <w:right w:type="dxa" w:w="90"/>
+            </w:tcMar>
+            <w:vAlign w:val="top"/>
+          </w:tcPr>
+          <w:p>
+            <w:pPr>
+              <w:spacing w:after="0" w:line="240"/>
+            </w:pPr>
+            <w:r>
+              <w:rPr>
+                <w:b/>
+                <w:bCs/>
+                <w:color w:val="0A1222"/>
+                <w:sz w:val="16"/>
+                <w:szCs w:val="16"/>
+                <w:rFonts w:ascii="Calibri" w:cs="Calibri" w:eastAsia="Calibri" w:hAnsi="Calibri"/>
+              </w:rPr>
+              <w:t xml:space="preserve">Hidden instructions</w:t>
+            </w:r>
+            <w:r>
+              <w:rPr>
+                <w:color w:val="1B2335"/>
+                <w:sz w:val="16"/>
+                <w:szCs w:val="16"/>
+                <w:rFonts w:ascii="Calibri" w:cs="Calibri" w:eastAsia="Calibri" w:hAnsi="Calibri"/>
+              </w:rPr>
+              <w:t xml:space="preserve"> in an enquiry</w:t>
+            </w:r>
+          </w:p>
+        </w:tc>
+        <w:tc>
+          <w:tcPr>
+            <w:tcW w:type="dxa" w:w="2303"/>
+            <w:tcBorders>
+              <w:top w:val="single" w:color="D5DBE5" w:sz="4"/>
+              <w:left w:val="single" w:color="D5DBE5" w:sz="4"/>
+              <w:bottom w:val="single" w:color="D5DBE5" w:sz="4"/>
+              <w:right w:val="single" w:color="D5DBE5" w:sz="4"/>
+            </w:tcBorders>
+            <w:shd w:fill="FFFFFF" w:color="auto" w:val="clear"/>
+            <w:tcMar>
+              <w:top w:type="dxa" w:w="50"/>
+              <w:left w:type="dxa" w:w="90"/>
+              <w:bottom w:type="dxa" w:w="50"/>
+              <w:right w:type="dxa" w:w="90"/>
+            </w:tcMar>
+            <w:vAlign w:val="top"/>
+          </w:tcPr>
+          <w:p>
+            <w:pPr>
+              <w:spacing w:after="0" w:line="240"/>
+            </w:pPr>
+            <w:r>
+              <w:rPr>
+                <w:color w:val="1B2335"/>
+                <w:sz w:val="16"/>
+                <w:szCs w:val="16"/>
+                <w:rFonts w:ascii="Calibri" w:cs="Calibri" w:eastAsia="Calibri" w:hAnsi="Calibri"/>
+              </w:rPr>
+              <w:t xml:space="preserve">Flagged by any of the three runs</w:t>
+            </w:r>
+          </w:p>
+        </w:tc>
+        <w:tc>
+          <w:tcPr>
+            <w:tcW w:type="dxa" w:w="2658"/>
+            <w:tcBorders>
+              <w:top w:val="single" w:color="D5DBE5" w:sz="4"/>
+              <w:left w:val="single" w:color="D5DBE5" w:sz="4"/>
+              <w:bottom w:val="single" w:color="D5DBE5" w:sz="4"/>
+              <w:right w:val="single" w:color="D5DBE5" w:sz="4"/>
+            </w:tcBorders>
+            <w:shd w:fill="FFFFFF" w:color="auto" w:val="clear"/>
+            <w:tcMar>
+              <w:top w:type="dxa" w:w="50"/>
+              <w:left w:type="dxa" w:w="90"/>
+              <w:bottom w:type="dxa" w:w="50"/>
+              <w:right w:type="dxa" w:w="90"/>
+            </w:tcMar>
+            <w:vAlign w:val="top"/>
+          </w:tcPr>
+          <w:p>
+            <w:pPr>
+              <w:spacing w:after="0" w:line="240"/>
+            </w:pPr>
+            <w:r>
+              <w:rPr>
+                <w:color w:val="1B2335"/>
+                <w:sz w:val="16"/>
+                <w:szCs w:val="16"/>
+                <w:rFonts w:ascii="Calibri" w:cs="Calibri" w:eastAsia="Calibri" w:hAnsi="Calibri"/>
+              </w:rPr>
+              <w:t xml:space="preserve">Always goes to a person; the model cannot choose a destination</w:t>
+            </w:r>
+          </w:p>
+        </w:tc>
+        <w:tc>
+          <w:tcPr>
+            <w:tcW w:type="dxa" w:w="2746"/>
+            <w:tcBorders>
+              <w:top w:val="single" w:color="D5DBE5" w:sz="4"/>
+              <w:left w:val="single" w:color="D5DBE5" w:sz="4"/>
+              <w:bottom w:val="single" w:color="D5DBE5" w:sz="4"/>
+              <w:right w:val="single" w:color="D5DBE5" w:sz="4"/>
+            </w:tcBorders>
+            <w:shd w:fill="FFFFFF" w:color="auto" w:val="clear"/>
+            <w:tcMar>
+              <w:top w:type="dxa" w:w="50"/>
+              <w:left w:type="dxa" w:w="90"/>
+              <w:bottom w:type="dxa" w:w="50"/>
+              <w:right w:type="dxa" w:w="90"/>
+            </w:tcMar>
+            <w:vAlign w:val="top"/>
+          </w:tcPr>
+          <w:p>
+            <w:pPr>
+              <w:spacing w:after="0" w:line="240"/>
+            </w:pPr>
+            <w:r>
+              <w:rPr>
+                <w:color w:val="1B2335"/>
+                <w:sz w:val="16"/>
+                <w:szCs w:val="16"/>
+                <w:rFonts w:ascii="Calibri" w:cs="Calibri" w:eastAsia="Calibri" w:hAnsi="Calibri"/>
+              </w:rPr>
+              <w:t xml:space="preserve">Reviewer handles it; example joins the test set</w:t>
+            </w:r>
+          </w:p>
+        </w:tc>
+      </w:tr>
+      <w:tr>
+        <w:trPr>
+          <w:cantSplit/>
+        </w:trPr>
+        <w:tc>
+          <w:tcPr>
+            <w:tcW w:type="dxa" w:w="2039"/>
+            <w:tcBorders>
+              <w:top w:val="single" w:color="D5DBE5" w:sz="4"/>
+              <w:left w:val="single" w:color="D5DBE5" w:sz="4"/>
+              <w:bottom w:val="single" w:color="D5DBE5" w:sz="4"/>
+              <w:right w:val="single" w:color="D5DBE5" w:sz="4"/>
+            </w:tcBorders>
+            <w:shd w:fill="F7F9FC" w:color="auto" w:val="clear"/>
+            <w:tcMar>
+              <w:top w:type="dxa" w:w="50"/>
+              <w:left w:type="dxa" w:w="90"/>
+              <w:bottom w:type="dxa" w:w="50"/>
+              <w:right w:type="dxa" w:w="90"/>
+            </w:tcMar>
+            <w:vAlign w:val="top"/>
+          </w:tcPr>
+          <w:p>
+            <w:pPr>
+              <w:spacing w:after="0" w:line="240"/>
+            </w:pPr>
+            <w:r>
+              <w:rPr>
+                <w:b/>
+                <w:bCs/>
+                <w:color w:val="0A1222"/>
+                <w:sz w:val="16"/>
+                <w:szCs w:val="16"/>
+                <w:rFonts w:ascii="Calibri" w:cs="Calibri" w:eastAsia="Calibri" w:hAnsi="Calibri"/>
+              </w:rPr>
+              <w:t xml:space="preserve">Model or provider fails</w:t>
+            </w:r>
+          </w:p>
+        </w:tc>
+        <w:tc>
+          <w:tcPr>
+            <w:tcW w:type="dxa" w:w="2303"/>
+            <w:tcBorders>
+              <w:top w:val="single" w:color="D5DBE5" w:sz="4"/>
+              <w:left w:val="single" w:color="D5DBE5" w:sz="4"/>
+              <w:bottom w:val="single" w:color="D5DBE5" w:sz="4"/>
+              <w:right w:val="single" w:color="D5DBE5" w:sz="4"/>
+            </w:tcBorders>
+            <w:shd w:fill="F7F9FC" w:color="auto" w:val="clear"/>
+            <w:tcMar>
+              <w:top w:type="dxa" w:w="50"/>
+              <w:left w:type="dxa" w:w="90"/>
+              <w:bottom w:type="dxa" w:w="50"/>
+              <w:right w:type="dxa" w:w="90"/>
+            </w:tcMar>
+            <w:vAlign w:val="top"/>
+          </w:tcPr>
+          <w:p>
+            <w:pPr>
+              <w:spacing w:after="0" w:line="240"/>
+            </w:pPr>
+            <w:r>
+              <w:rPr>
+                <w:color w:val="1B2335"/>
+                <w:sz w:val="16"/>
+                <w:szCs w:val="16"/>
+                <w:rFonts w:ascii="Calibri" w:cs="Calibri" w:eastAsia="Calibri" w:hAnsi="Calibri"/>
+              </w:rPr>
+              <w:t xml:space="preserve">Failure-rate and response-time alerts</w:t>
+            </w:r>
+          </w:p>
+        </w:tc>
+        <w:tc>
+          <w:tcPr>
+            <w:tcW w:type="dxa" w:w="2658"/>
+            <w:tcBorders>
+              <w:top w:val="single" w:color="D5DBE5" w:sz="4"/>
+              <w:left w:val="single" w:color="D5DBE5" w:sz="4"/>
+              <w:bottom w:val="single" w:color="D5DBE5" w:sz="4"/>
+              <w:right w:val="single" w:color="D5DBE5" w:sz="4"/>
+            </w:tcBorders>
+            <w:shd w:fill="F7F9FC" w:color="auto" w:val="clear"/>
+            <w:tcMar>
+              <w:top w:type="dxa" w:w="50"/>
+              <w:left w:type="dxa" w:w="90"/>
+              <w:bottom w:type="dxa" w:w="50"/>
+              <w:right w:type="dxa" w:w="90"/>
+            </w:tcMar>
+            <w:vAlign w:val="top"/>
+          </w:tcPr>
+          <w:p>
+            <w:pPr>
+              <w:spacing w:after="0" w:line="240"/>
+            </w:pPr>
+            <w:r>
+              <w:rPr>
+                <w:color w:val="1B2335"/>
+                <w:sz w:val="16"/>
+                <w:szCs w:val="16"/>
+                <w:rFonts w:ascii="Calibri" w:cs="Calibri" w:eastAsia="Calibri" w:hAnsi="Calibri"/>
+              </w:rPr>
+              <w:t xml:space="preserve">Retry, then backup model, then review queue; nothing dropped</w:t>
+            </w:r>
+          </w:p>
+        </w:tc>
+        <w:tc>
+          <w:tcPr>
+            <w:tcW w:type="dxa" w:w="2746"/>
+            <w:tcBorders>
+              <w:top w:val="single" w:color="D5DBE5" w:sz="4"/>
+              <w:left w:val="single" w:color="D5DBE5" w:sz="4"/>
+              <w:bottom w:val="single" w:color="D5DBE5" w:sz="4"/>
+              <w:right w:val="single" w:color="D5DBE5" w:sz="4"/>
+            </w:tcBorders>
+            <w:shd w:fill="F7F9FC" w:color="auto" w:val="clear"/>
+            <w:tcMar>
+              <w:top w:type="dxa" w:w="50"/>
+              <w:left w:type="dxa" w:w="90"/>
+              <w:bottom w:type="dxa" w:w="50"/>
+              <w:right w:type="dxa" w:w="90"/>
+            </w:tcMar>
+            <w:vAlign w:val="top"/>
+          </w:tcPr>
+          <w:p>
+            <w:pPr>
+              <w:spacing w:after="0" w:line="240"/>
+            </w:pPr>
+            <w:r>
+              <w:rPr>
+                <w:color w:val="1B2335"/>
+                <w:sz w:val="16"/>
+                <w:szCs w:val="16"/>
+                <w:rFonts w:ascii="Calibri" w:cs="Calibri" w:eastAsia="Calibri" w:hAnsi="Calibri"/>
+              </w:rPr>
+              <w:t xml:space="preserve">Pause automatic routing until stable</w:t>
+            </w:r>
+          </w:p>
+        </w:tc>
+      </w:tr>
+      <w:tr>
+        <w:trPr>
+          <w:cantSplit/>
+        </w:trPr>
+        <w:tc>
+          <w:tcPr>
+            <w:tcW w:type="dxa" w:w="2039"/>
+            <w:tcBorders>
+              <w:top w:val="single" w:color="D5DBE5" w:sz="4"/>
+              <w:left w:val="single" w:color="D5DBE5" w:sz="4"/>
+              <w:bottom w:val="single" w:color="D5DBE5" w:sz="4"/>
+              <w:right w:val="single" w:color="D5DBE5" w:sz="4"/>
+            </w:tcBorders>
+            <w:shd w:fill="FFFFFF" w:color="auto" w:val="clear"/>
+            <w:tcMar>
+              <w:top w:type="dxa" w:w="50"/>
+              <w:left w:type="dxa" w:w="90"/>
+              <w:bottom w:type="dxa" w:w="50"/>
+              <w:right w:type="dxa" w:w="90"/>
+            </w:tcMar>
+            <w:vAlign w:val="top"/>
+          </w:tcPr>
+          <w:p>
+            <w:pPr>
+              <w:spacing w:after="0" w:line="240"/>
+            </w:pPr>
+            <w:r>
+              <w:rPr>
+                <w:b/>
+                <w:bCs/>
+                <w:color w:val="0A1222"/>
+                <w:sz w:val="16"/>
+                <w:szCs w:val="16"/>
+                <w:rFonts w:ascii="Calibri" w:cs="Calibri" w:eastAsia="Calibri" w:hAnsi="Calibri"/>
+              </w:rPr>
+              <w:t xml:space="preserve">A change makes things worse</w:t>
+            </w:r>
+          </w:p>
+        </w:tc>
+        <w:tc>
+          <w:tcPr>
+            <w:tcW w:type="dxa" w:w="2303"/>
+            <w:tcBorders>
+              <w:top w:val="single" w:color="D5DBE5" w:sz="4"/>
+              <w:left w:val="single" w:color="D5DBE5" w:sz="4"/>
+              <w:bottom w:val="single" w:color="D5DBE5" w:sz="4"/>
+              <w:right w:val="single" w:color="D5DBE5" w:sz="4"/>
+            </w:tcBorders>
+            <w:shd w:fill="FFFFFF" w:color="auto" w:val="clear"/>
+            <w:tcMar>
+              <w:top w:type="dxa" w:w="50"/>
+              <w:left w:type="dxa" w:w="90"/>
+              <w:bottom w:type="dxa" w:w="50"/>
+              <w:right w:type="dxa" w:w="90"/>
+            </w:tcMar>
+            <w:vAlign w:val="top"/>
+          </w:tcPr>
+          <w:p>
+            <w:pPr>
+              <w:spacing w:after="0" w:line="240"/>
+            </w:pPr>
+            <w:r>
+              <w:rPr>
+                <w:color w:val="1B2335"/>
+                <w:sz w:val="16"/>
+                <w:szCs w:val="16"/>
+                <w:rFonts w:ascii="Calibri" w:cs="Calibri" w:eastAsia="Calibri" w:hAnsi="Calibri"/>
+              </w:rPr>
+              <w:t xml:space="preserve">Test suite on every change; error rate after release</w:t>
+            </w:r>
+          </w:p>
+        </w:tc>
+        <w:tc>
+          <w:tcPr>
+            <w:tcW w:type="dxa" w:w="2658"/>
+            <w:tcBorders>
+              <w:top w:val="single" w:color="D5DBE5" w:sz="4"/>
+              <w:left w:val="single" w:color="D5DBE5" w:sz="4"/>
+              <w:bottom w:val="single" w:color="D5DBE5" w:sz="4"/>
+              <w:right w:val="single" w:color="D5DBE5" w:sz="4"/>
+            </w:tcBorders>
+            <w:shd w:fill="FFFFFF" w:color="auto" w:val="clear"/>
+            <w:tcMar>
+              <w:top w:type="dxa" w:w="50"/>
+              <w:left w:type="dxa" w:w="90"/>
+              <w:bottom w:type="dxa" w:w="50"/>
+              <w:right w:type="dxa" w:w="90"/>
+            </w:tcMar>
+            <w:vAlign w:val="top"/>
+          </w:tcPr>
+          <w:p>
+            <w:pPr>
+              <w:spacing w:after="0" w:line="240"/>
+            </w:pPr>
+            <w:r>
+              <w:rPr>
+                <w:color w:val="1B2335"/>
+                <w:sz w:val="16"/>
+                <w:szCs w:val="16"/>
+                <w:rFonts w:ascii="Calibri" w:cs="Calibri" w:eastAsia="Calibri" w:hAnsi="Calibri"/>
+              </w:rPr>
+              <w:t xml:space="preserve">Each decision records the prompt and configuration that made it</w:t>
+            </w:r>
+          </w:p>
+        </w:tc>
+        <w:tc>
+          <w:tcPr>
+            <w:tcW w:type="dxa" w:w="2746"/>
+            <w:tcBorders>
+              <w:top w:val="single" w:color="D5DBE5" w:sz="4"/>
+              <w:left w:val="single" w:color="D5DBE5" w:sz="4"/>
+              <w:bottom w:val="single" w:color="D5DBE5" w:sz="4"/>
+              <w:right w:val="single" w:color="D5DBE5" w:sz="4"/>
+            </w:tcBorders>
+            <w:shd w:fill="FFFFFF" w:color="auto" w:val="clear"/>
+            <w:tcMar>
+              <w:top w:type="dxa" w:w="50"/>
+              <w:left w:type="dxa" w:w="90"/>
+              <w:bottom w:type="dxa" w:w="50"/>
+              <w:right w:type="dxa" w:w="90"/>
+            </w:tcMar>
+            <w:vAlign w:val="top"/>
+          </w:tcPr>
+          <w:p>
+            <w:pPr>
+              <w:spacing w:after="0" w:line="240"/>
+            </w:pPr>
+            <w:r>
+              <w:rPr>
+                <w:color w:val="1B2335"/>
+                <w:sz w:val="16"/>
+                <w:szCs w:val="16"/>
+                <w:rFonts w:ascii="Calibri" w:cs="Calibri" w:eastAsia="Calibri" w:hAnsi="Calibri"/>
+              </w:rPr>
+              <w:t xml:space="preserve">Revert in one click; pause or use fallback mode meanwhile</w:t>
             </w:r>
           </w:p>
         </w:tc>
@@ -3666,7 +4250,7 @@
     </w:tbl>
     <w:p>
       <w:pPr>
-        <w:spacing w:after="60"/>
+        <w:spacing w:after="40"/>
       </w:pPr>
     </w:p>
     <w:p>
@@ -3682,6 +4266,116 @@
           <w:szCs w:val="20"/>
           <w:rFonts w:ascii="Calibri" w:cs="Calibri" w:eastAsia="Calibri" w:hAnsi="Calibri"/>
         </w:rPr>
+        <w:t xml:space="preserve">Switches</w:t>
+      </w:r>
+      <w:r>
+        <w:rPr>
+          <w:color w:val="1B2335"/>
+          <w:sz w:val="20"/>
+          <w:szCs w:val="20"/>
+          <w:rFonts w:ascii="Calibri" w:cs="Calibri" w:eastAsia="Calibri" w:hAnsi="Calibri"/>
+        </w:rPr>
+        <w:t xml:space="preserve">, on the configuration screen and previewed before saving: pause automatic routing, put one service line in fallback mode, or revert any change.</w:t>
+      </w:r>
+    </w:p>
+    <w:p>
+      <w:pPr>
+        <w:spacing w:before="0" w:after="80" w:line="264"/>
+      </w:pPr>
+      <w:r>
+        <w:rPr>
+          <w:b/>
+          <w:bCs/>
+          <w:color w:val="0A1222"/>
+          <w:sz w:val="20"/>
+          <w:szCs w:val="20"/>
+          <w:rFonts w:ascii="Calibri" w:cs="Calibri" w:eastAsia="Calibri" w:hAnsi="Calibri"/>
+        </w:rPr>
+        <w:t xml:space="preserve">Rollout.</w:t>
+      </w:r>
+      <w:r>
+        <w:rPr>
+          <w:color w:val="1B2335"/>
+          <w:sz w:val="20"/>
+          <w:szCs w:val="20"/>
+          <w:rFonts w:ascii="Calibri" w:cs="Calibri" w:eastAsia="Calibri" w:hAnsi="Calibri"/>
+        </w:rPr>
+        <w:t xml:space="preserve"> </w:t>
+      </w:r>
+      <w:r>
+        <w:rPr>
+          <w:b/>
+          <w:bCs/>
+          <w:color w:val="0A1222"/>
+          <w:sz w:val="20"/>
+          <w:szCs w:val="20"/>
+          <w:rFonts w:ascii="Calibri" w:cs="Calibri" w:eastAsia="Calibri" w:hAnsi="Calibri"/>
+        </w:rPr>
+        <w:t xml:space="preserve">Shadow</w:t>
+      </w:r>
+      <w:r>
+        <w:rPr>
+          <w:color w:val="1B2335"/>
+          <w:sz w:val="20"/>
+          <w:szCs w:val="20"/>
+          <w:rFonts w:ascii="Calibri" w:cs="Calibri" w:eastAsia="Calibri" w:hAnsi="Calibri"/>
+        </w:rPr>
+        <w:t xml:space="preserve"> (2–4 weeks): the system runs silently and is compared with the analyst weekly. It moves on when at least 95% of enquiries needing a person are caught, at least 95% of automatic routes are correct, and no conflict or manipulation attempt is missed. </w:t>
+      </w:r>
+      <w:r>
+        <w:rPr>
+          <w:b/>
+          <w:bCs/>
+          <w:color w:val="0A1222"/>
+          <w:sz w:val="20"/>
+          <w:szCs w:val="20"/>
+          <w:rFonts w:ascii="Calibri" w:cs="Calibri" w:eastAsia="Calibri" w:hAnsi="Calibri"/>
+        </w:rPr>
+        <w:t xml:space="preserve">Assisted</w:t>
+      </w:r>
+      <w:r>
+        <w:rPr>
+          <w:color w:val="1B2335"/>
+          <w:sz w:val="20"/>
+          <w:szCs w:val="20"/>
+          <w:rFonts w:ascii="Calibri" w:cs="Calibri" w:eastAsia="Calibri" w:hAnsi="Calibri"/>
+        </w:rPr>
+        <w:t xml:space="preserve"> (4–8 weeks): leads confirm each suggestion with a click, and the analyst works only the review queue. It moves on when model errors are below 10% in every line. </w:t>
+      </w:r>
+      <w:r>
+        <w:rPr>
+          <w:b/>
+          <w:bCs/>
+          <w:color w:val="0A1222"/>
+          <w:sz w:val="20"/>
+          <w:szCs w:val="20"/>
+          <w:rFonts w:ascii="Calibri" w:cs="Calibri" w:eastAsia="Calibri" w:hAnsi="Calibri"/>
+        </w:rPr>
+        <w:t xml:space="preserve">Automatic for clear-cut cases</w:t>
+      </w:r>
+      <w:r>
+        <w:rPr>
+          <w:color w:val="1B2335"/>
+          <w:sz w:val="20"/>
+          <w:szCs w:val="20"/>
+          <w:rFonts w:ascii="Calibri" w:cs="Calibri" w:eastAsia="Calibri" w:hAnsi="Calibri"/>
+        </w:rPr>
+        <w:t xml:space="preserve">, only while each line stays within its thresholds; a breach returns that line to assisted.</w:t>
+      </w:r>
+    </w:p>
+    <w:p>
+      <w:pPr>
+        <w:spacing w:before="0" w:after="100" w:line="264"/>
+      </w:pPr>
+      <w:r>
+        <w:rPr>
+          <w:b/>
+          <w:bCs/>
+          <w:color w:val="0A1222"/>
+          <w:sz w:val="20"/>
+          <w:szCs w:val="20"/>
+          <w:rFonts w:ascii="Calibri" w:cs="Calibri" w:eastAsia="Calibri" w:hAnsi="Calibri"/>
+        </w:rPr>
         <w:t xml:space="preserve">First 90 days.</w:t>
       </w:r>
       <w:r>
@@ -3691,7 +4385,7 @@
           <w:szCs w:val="20"/>
           <w:rFonts w:ascii="Calibri" w:cs="Calibri" w:eastAsia="Calibri" w:hAnsi="Calibri"/>
         </w:rPr>
-        <w:t xml:space="preserve"> Month one: connect the real CRM and conflicts system, add single sign-on, start shadow mode, and build a fresh test set labelled by two people. Month two: make complexity ratings evidence-based, send audit clients asking for services the firm can't also provide to them straight to a person, and move to assisted mode. Month three: turn on automatic routing where it has been earned, and pilot external enrichment for prospects.</w:t>
+        <w:t xml:space="preserve"> Connect the real CRM and conflicts system, add single sign-on and start shadow mode. Then move to evidence-based complexity, a hard stop for audit-independence cases, and assisted mode. Finally, automatic routing where it has been earned, and a pilot of external enrichment.</w:t>
       </w:r>
     </w:p>
     <w:p>
@@ -4308,12 +5002,6 @@
   </w:num>
   <w:num w:numId="3">
     <w:abstractNumId w:val="2"/>
-    <w:lvlOverride w:ilvl="0">
-      <w:startOverride w:val="1"/>
-    </w:lvlOverride>
-  </w:num>
-  <w:num w:numId="4">
-    <w:abstractNumId w:val="3"/>
     <w:lvlOverride w:ilvl="0">
       <w:startOverride w:val="1"/>
     </w:lvlOverride>

</xml_diff>